<commit_message>
Actividad 2 de Modelado de base de datos
</commit_message>
<xml_diff>
--- a/Modelo De Base de Datos/Actividad 1/Actividad 1 Construir Modelo conceptual de la base de datos (MER).docx
+++ b/Modelo De Base de Datos/Actividad 1/Actividad 1 Construir Modelo conceptual de la base de datos (MER).docx
@@ -773,7 +773,7 @@
           <w:r>
             <w:fldChar w:fldCharType="separate"/>
           </w:r>
-          <w:hyperlink w:anchor="_Toc229548786" w:history="1">
+          <w:hyperlink w:anchor="_Toc229564260" w:history="1">
             <w:r>
               <w:rPr>
                 <w:rStyle w:val="Hipervnculo"/>
@@ -818,7 +818,7 @@
                 <w:noProof/>
                 <w:webHidden/>
               </w:rPr>
-              <w:instrText xml:space="preserve"> PAGEREF _Toc229548786 \h </w:instrText>
+              <w:instrText xml:space="preserve"> PAGEREF _Toc229564260 \h </w:instrText>
             </w:r>
             <w:r>
               <w:rPr>
@@ -864,7 +864,7 @@
               <w14:ligatures w14:val="standardContextual"/>
             </w:rPr>
           </w:pPr>
-          <w:hyperlink w:anchor="_Toc229548787" w:history="1">
+          <w:hyperlink w:anchor="_Toc229564261" w:history="1">
             <w:r>
               <w:rPr>
                 <w:rStyle w:val="Hipervnculo"/>
@@ -891,7 +891,7 @@
                 <w:noProof/>
                 <w:webHidden/>
               </w:rPr>
-              <w:instrText xml:space="preserve"> PAGEREF _Toc229548787 \h </w:instrText>
+              <w:instrText xml:space="preserve"> PAGEREF _Toc229564261 \h </w:instrText>
             </w:r>
             <w:r>
               <w:rPr>
@@ -937,7 +937,7 @@
               <w14:ligatures w14:val="standardContextual"/>
             </w:rPr>
           </w:pPr>
-          <w:hyperlink w:anchor="_Toc229548788" w:history="1">
+          <w:hyperlink w:anchor="_Toc229564262" w:history="1">
             <w:r>
               <w:rPr>
                 <w:rStyle w:val="Hipervnculo"/>
@@ -964,7 +964,7 @@
                 <w:noProof/>
                 <w:webHidden/>
               </w:rPr>
-              <w:instrText xml:space="preserve"> PAGEREF _Toc229548788 \h </w:instrText>
+              <w:instrText xml:space="preserve"> PAGEREF _Toc229564262 \h </w:instrText>
             </w:r>
             <w:r>
               <w:rPr>
@@ -1010,7 +1010,7 @@
               <w14:ligatures w14:val="standardContextual"/>
             </w:rPr>
           </w:pPr>
-          <w:hyperlink w:anchor="_Toc229548789" w:history="1">
+          <w:hyperlink w:anchor="_Toc229564263" w:history="1">
             <w:r>
               <w:rPr>
                 <w:rStyle w:val="Hipervnculo"/>
@@ -1037,7 +1037,7 @@
                 <w:noProof/>
                 <w:webHidden/>
               </w:rPr>
-              <w:instrText xml:space="preserve"> PAGEREF _Toc229548789 \h </w:instrText>
+              <w:instrText xml:space="preserve"> PAGEREF _Toc229564263 \h </w:instrText>
             </w:r>
             <w:r>
               <w:rPr>
@@ -1083,7 +1083,7 @@
               <w14:ligatures w14:val="standardContextual"/>
             </w:rPr>
           </w:pPr>
-          <w:hyperlink w:anchor="_Toc229548790" w:history="1">
+          <w:hyperlink w:anchor="_Toc229564264" w:history="1">
             <w:r>
               <w:rPr>
                 <w:rStyle w:val="Hipervnculo"/>
@@ -1110,7 +1110,7 @@
                 <w:noProof/>
                 <w:webHidden/>
               </w:rPr>
-              <w:instrText xml:space="preserve"> PAGEREF _Toc229548790 \h </w:instrText>
+              <w:instrText xml:space="preserve"> PAGEREF _Toc229564264 \h </w:instrText>
             </w:r>
             <w:r>
               <w:rPr>
@@ -1157,7 +1157,7 @@
               <w14:ligatures w14:val="standardContextual"/>
             </w:rPr>
           </w:pPr>
-          <w:hyperlink w:anchor="_Toc229548791" w:history="1">
+          <w:hyperlink w:anchor="_Toc229564265" w:history="1">
             <w:r>
               <w:rPr>
                 <w:rStyle w:val="Hipervnculo"/>
@@ -1202,7 +1202,7 @@
                 <w:noProof/>
                 <w:webHidden/>
               </w:rPr>
-              <w:instrText xml:space="preserve"> PAGEREF _Toc229548791 \h </w:instrText>
+              <w:instrText xml:space="preserve"> PAGEREF _Toc229564265 \h </w:instrText>
             </w:r>
             <w:r>
               <w:rPr>
@@ -1248,7 +1248,7 @@
               <w14:ligatures w14:val="standardContextual"/>
             </w:rPr>
           </w:pPr>
-          <w:hyperlink w:anchor="_Toc229548792" w:history="1">
+          <w:hyperlink w:anchor="_Toc229564266" w:history="1">
             <w:r>
               <w:rPr>
                 <w:rStyle w:val="Hipervnculo"/>
@@ -1275,7 +1275,7 @@
                 <w:noProof/>
                 <w:webHidden/>
               </w:rPr>
-              <w:instrText xml:space="preserve"> PAGEREF _Toc229548792 \h </w:instrText>
+              <w:instrText xml:space="preserve"> PAGEREF _Toc229564266 \h </w:instrText>
             </w:r>
             <w:r>
               <w:rPr>
@@ -1321,7 +1321,7 @@
               <w14:ligatures w14:val="standardContextual"/>
             </w:rPr>
           </w:pPr>
-          <w:hyperlink w:anchor="_Toc229548793" w:history="1">
+          <w:hyperlink w:anchor="_Toc229564267" w:history="1">
             <w:r>
               <w:rPr>
                 <w:rStyle w:val="Hipervnculo"/>
@@ -1348,7 +1348,7 @@
                 <w:noProof/>
                 <w:webHidden/>
               </w:rPr>
-              <w:instrText xml:space="preserve"> PAGEREF _Toc229548793 \h </w:instrText>
+              <w:instrText xml:space="preserve"> PAGEREF _Toc229564267 \h </w:instrText>
             </w:r>
             <w:r>
               <w:rPr>
@@ -1394,7 +1394,7 @@
               <w14:ligatures w14:val="standardContextual"/>
             </w:rPr>
           </w:pPr>
-          <w:hyperlink w:anchor="_Toc229548794" w:history="1">
+          <w:hyperlink w:anchor="_Toc229564268" w:history="1">
             <w:r>
               <w:rPr>
                 <w:rStyle w:val="Hipervnculo"/>
@@ -1421,7 +1421,7 @@
                 <w:noProof/>
                 <w:webHidden/>
               </w:rPr>
-              <w:instrText xml:space="preserve"> PAGEREF _Toc229548794 \h </w:instrText>
+              <w:instrText xml:space="preserve"> PAGEREF _Toc229564268 \h </w:instrText>
             </w:r>
             <w:r>
               <w:rPr>
@@ -1467,7 +1467,7 @@
               <w14:ligatures w14:val="standardContextual"/>
             </w:rPr>
           </w:pPr>
-          <w:hyperlink w:anchor="_Toc229548795" w:history="1">
+          <w:hyperlink w:anchor="_Toc229564269" w:history="1">
             <w:r>
               <w:rPr>
                 <w:rStyle w:val="Hipervnculo"/>
@@ -1494,7 +1494,7 @@
                 <w:noProof/>
                 <w:webHidden/>
               </w:rPr>
-              <w:instrText xml:space="preserve"> PAGEREF _Toc229548795 \h </w:instrText>
+              <w:instrText xml:space="preserve"> PAGEREF _Toc229564269 \h </w:instrText>
             </w:r>
             <w:r>
               <w:rPr>
@@ -1540,7 +1540,7 @@
               <w14:ligatures w14:val="standardContextual"/>
             </w:rPr>
           </w:pPr>
-          <w:hyperlink w:anchor="_Toc229548796" w:history="1">
+          <w:hyperlink w:anchor="_Toc229564270" w:history="1">
             <w:r>
               <w:rPr>
                 <w:rStyle w:val="Hipervnculo"/>
@@ -1567,7 +1567,7 @@
                 <w:noProof/>
                 <w:webHidden/>
               </w:rPr>
-              <w:instrText xml:space="preserve"> PAGEREF _Toc229548796 \h </w:instrText>
+              <w:instrText xml:space="preserve"> PAGEREF _Toc229564270 \h </w:instrText>
             </w:r>
             <w:r>
               <w:rPr>
@@ -1613,7 +1613,7 @@
               <w14:ligatures w14:val="standardContextual"/>
             </w:rPr>
           </w:pPr>
-          <w:hyperlink w:anchor="_Toc229548797" w:history="1">
+          <w:hyperlink w:anchor="_Toc229564271" w:history="1">
             <w:r>
               <w:rPr>
                 <w:rStyle w:val="Hipervnculo"/>
@@ -1640,7 +1640,7 @@
                 <w:noProof/>
                 <w:webHidden/>
               </w:rPr>
-              <w:instrText xml:space="preserve"> PAGEREF _Toc229548797 \h </w:instrText>
+              <w:instrText xml:space="preserve"> PAGEREF _Toc229564271 \h </w:instrText>
             </w:r>
             <w:r>
               <w:rPr>
@@ -1686,7 +1686,7 @@
               <w14:ligatures w14:val="standardContextual"/>
             </w:rPr>
           </w:pPr>
-          <w:hyperlink w:anchor="_Toc229548798" w:history="1">
+          <w:hyperlink w:anchor="_Toc229564272" w:history="1">
             <w:r>
               <w:rPr>
                 <w:rStyle w:val="Hipervnculo"/>
@@ -1713,7 +1713,7 @@
                 <w:noProof/>
                 <w:webHidden/>
               </w:rPr>
-              <w:instrText xml:space="preserve"> PAGEREF _Toc229548798 \h </w:instrText>
+              <w:instrText xml:space="preserve"> PAGEREF _Toc229564272 \h </w:instrText>
             </w:r>
             <w:r>
               <w:rPr>
@@ -1759,7 +1759,7 @@
               <w14:ligatures w14:val="standardContextual"/>
             </w:rPr>
           </w:pPr>
-          <w:hyperlink w:anchor="_Toc229548799" w:history="1">
+          <w:hyperlink w:anchor="_Toc229564273" w:history="1">
             <w:r>
               <w:rPr>
                 <w:rStyle w:val="Hipervnculo"/>
@@ -1786,7 +1786,7 @@
                 <w:noProof/>
                 <w:webHidden/>
               </w:rPr>
-              <w:instrText xml:space="preserve"> PAGEREF _Toc229548799 \h </w:instrText>
+              <w:instrText xml:space="preserve"> PAGEREF _Toc229564273 \h </w:instrText>
             </w:r>
             <w:r>
               <w:rPr>
@@ -1832,7 +1832,7 @@
               <w14:ligatures w14:val="standardContextual"/>
             </w:rPr>
           </w:pPr>
-          <w:hyperlink w:anchor="_Toc229548800" w:history="1">
+          <w:hyperlink w:anchor="_Toc229564274" w:history="1">
             <w:r>
               <w:rPr>
                 <w:rStyle w:val="Hipervnculo"/>
@@ -1859,7 +1859,7 @@
                 <w:noProof/>
                 <w:webHidden/>
               </w:rPr>
-              <w:instrText xml:space="preserve"> PAGEREF _Toc229548800 \h </w:instrText>
+              <w:instrText xml:space="preserve"> PAGEREF _Toc229564274 \h </w:instrText>
             </w:r>
             <w:r>
               <w:rPr>
@@ -1994,165 +1994,6 @@
     </w:p>
     <w:p>
       <w:pPr>
-        <w:spacing w:after="0" w:line="240" w:lineRule="auto"/>
-        <w:rPr>
-          <w:rFonts w:ascii="Arial" w:hAnsi="Arial" w:cs="Arial"/>
-          <w:sz w:val="28"/>
-          <w:szCs w:val="28"/>
-        </w:rPr>
-      </w:pPr>
-    </w:p>
-    <w:p>
-      <w:pPr>
-        <w:spacing w:after="0" w:line="240" w:lineRule="auto"/>
-        <w:rPr>
-          <w:rFonts w:ascii="Arial" w:hAnsi="Arial" w:cs="Arial"/>
-          <w:sz w:val="28"/>
-          <w:szCs w:val="28"/>
-        </w:rPr>
-      </w:pPr>
-    </w:p>
-    <w:p>
-      <w:pPr>
-        <w:spacing w:after="0" w:line="240" w:lineRule="auto"/>
-        <w:rPr>
-          <w:rFonts w:ascii="Arial" w:hAnsi="Arial" w:cs="Arial"/>
-          <w:sz w:val="28"/>
-          <w:szCs w:val="28"/>
-        </w:rPr>
-      </w:pPr>
-    </w:p>
-    <w:p>
-      <w:pPr>
-        <w:spacing w:after="0" w:line="240" w:lineRule="auto"/>
-        <w:rPr>
-          <w:rFonts w:ascii="Arial" w:hAnsi="Arial" w:cs="Arial"/>
-          <w:sz w:val="28"/>
-          <w:szCs w:val="28"/>
-        </w:rPr>
-      </w:pPr>
-    </w:p>
-    <w:p>
-      <w:pPr>
-        <w:spacing w:after="0" w:line="240" w:lineRule="auto"/>
-        <w:rPr>
-          <w:rFonts w:ascii="Arial" w:hAnsi="Arial" w:cs="Arial"/>
-          <w:sz w:val="28"/>
-          <w:szCs w:val="28"/>
-        </w:rPr>
-      </w:pPr>
-    </w:p>
-    <w:p>
-      <w:pPr>
-        <w:spacing w:after="0" w:line="240" w:lineRule="auto"/>
-        <w:rPr>
-          <w:rFonts w:ascii="Arial" w:hAnsi="Arial" w:cs="Arial"/>
-          <w:sz w:val="28"/>
-          <w:szCs w:val="28"/>
-        </w:rPr>
-      </w:pPr>
-    </w:p>
-    <w:p>
-      <w:pPr>
-        <w:spacing w:after="0" w:line="240" w:lineRule="auto"/>
-        <w:rPr>
-          <w:rFonts w:ascii="Arial" w:hAnsi="Arial" w:cs="Arial"/>
-          <w:sz w:val="28"/>
-          <w:szCs w:val="28"/>
-        </w:rPr>
-      </w:pPr>
-    </w:p>
-    <w:p>
-      <w:pPr>
-        <w:spacing w:after="0" w:line="240" w:lineRule="auto"/>
-        <w:rPr>
-          <w:rFonts w:ascii="Arial" w:hAnsi="Arial" w:cs="Arial"/>
-          <w:sz w:val="28"/>
-          <w:szCs w:val="28"/>
-        </w:rPr>
-      </w:pPr>
-    </w:p>
-    <w:p>
-      <w:pPr>
-        <w:spacing w:after="0" w:line="240" w:lineRule="auto"/>
-        <w:rPr>
-          <w:rFonts w:ascii="Arial" w:hAnsi="Arial" w:cs="Arial"/>
-          <w:sz w:val="28"/>
-          <w:szCs w:val="28"/>
-        </w:rPr>
-      </w:pPr>
-    </w:p>
-    <w:p>
-      <w:pPr>
-        <w:spacing w:after="0" w:line="240" w:lineRule="auto"/>
-        <w:rPr>
-          <w:rFonts w:ascii="Arial" w:hAnsi="Arial" w:cs="Arial"/>
-          <w:sz w:val="28"/>
-          <w:szCs w:val="28"/>
-        </w:rPr>
-      </w:pPr>
-    </w:p>
-    <w:p>
-      <w:pPr>
-        <w:spacing w:after="0" w:line="240" w:lineRule="auto"/>
-        <w:rPr>
-          <w:rFonts w:ascii="Arial" w:hAnsi="Arial" w:cs="Arial"/>
-          <w:sz w:val="28"/>
-          <w:szCs w:val="28"/>
-        </w:rPr>
-      </w:pPr>
-    </w:p>
-    <w:p>
-      <w:pPr>
-        <w:spacing w:after="0" w:line="240" w:lineRule="auto"/>
-        <w:rPr>
-          <w:rFonts w:ascii="Arial" w:hAnsi="Arial" w:cs="Arial"/>
-          <w:sz w:val="28"/>
-          <w:szCs w:val="28"/>
-        </w:rPr>
-      </w:pPr>
-    </w:p>
-    <w:p>
-      <w:pPr>
-        <w:spacing w:after="0" w:line="240" w:lineRule="auto"/>
-        <w:rPr>
-          <w:rFonts w:ascii="Arial" w:hAnsi="Arial" w:cs="Arial"/>
-          <w:sz w:val="28"/>
-          <w:szCs w:val="28"/>
-        </w:rPr>
-      </w:pPr>
-    </w:p>
-    <w:p>
-      <w:pPr>
-        <w:spacing w:after="0" w:line="240" w:lineRule="auto"/>
-        <w:rPr>
-          <w:rFonts w:ascii="Arial" w:hAnsi="Arial" w:cs="Arial"/>
-          <w:sz w:val="28"/>
-          <w:szCs w:val="28"/>
-        </w:rPr>
-      </w:pPr>
-    </w:p>
-    <w:p>
-      <w:pPr>
-        <w:spacing w:after="0" w:line="240" w:lineRule="auto"/>
-        <w:rPr>
-          <w:rFonts w:ascii="Arial" w:hAnsi="Arial" w:cs="Arial"/>
-          <w:sz w:val="28"/>
-          <w:szCs w:val="28"/>
-        </w:rPr>
-      </w:pPr>
-    </w:p>
-    <w:p>
-      <w:pPr>
-        <w:rPr>
-          <w:rFonts w:ascii="Arial" w:hAnsi="Arial" w:cs="Arial"/>
-          <w:sz w:val="24"/>
-          <w:szCs w:val="24"/>
-        </w:rPr>
-      </w:pPr>
-    </w:p>
-    <w:p>
-      <w:pPr>
         <w:rPr>
           <w:rFonts w:ascii="Arial" w:hAnsi="Arial" w:cs="Arial"/>
           <w:sz w:val="24"/>
@@ -2168,8 +2009,9 @@
           <w:numId w:val="9"/>
         </w:numPr>
       </w:pPr>
-      <w:bookmarkStart w:id="0" w:name="_Toc229548786"/>
-      <w:r>
+      <w:bookmarkStart w:id="0" w:name="_Toc229564260"/>
+      <w:r>
+        <w:lastRenderedPageBreak/>
         <w:t>Modelar entidades:</w:t>
       </w:r>
       <w:bookmarkEnd w:id="0"/>
@@ -2183,7 +2025,7 @@
       <w:pPr>
         <w:pStyle w:val="Ttulo2"/>
       </w:pPr>
-      <w:bookmarkStart w:id="1" w:name="_Toc229548787"/>
+      <w:bookmarkStart w:id="1" w:name="_Toc229564261"/>
       <w:r>
         <w:t>Modelar la entidad Persona con los siguientes atributos:</w:t>
       </w:r>
@@ -2247,7 +2089,7 @@
       <w:pPr>
         <w:pStyle w:val="Ttulo3"/>
       </w:pPr>
-      <w:bookmarkStart w:id="2" w:name="_Toc229548788"/>
+      <w:bookmarkStart w:id="2" w:name="_Toc229564262"/>
       <w:r>
         <w:t>solución</w:t>
       </w:r>
@@ -2402,7 +2244,6 @@
         <w:rPr>
           <w:noProof/>
         </w:rPr>
-        <w:lastRenderedPageBreak/>
         <w:drawing>
           <wp:inline distT="0" distB="0" distL="0" distR="0" wp14:anchorId="509FD86C" wp14:editId="141C4FE7">
             <wp:extent cx="3298371" cy="2940147"/>
@@ -2460,9 +2301,10 @@
     </w:p>
     <w:p>
       <w:r>
+        <w:lastRenderedPageBreak/>
         <w:t xml:space="preserve"> </w:t>
       </w:r>
-      <w:bookmarkStart w:id="3" w:name="_Toc229548789"/>
+      <w:bookmarkStart w:id="3" w:name="_Toc229564263"/>
       <w:r>
         <w:rPr>
           <w:rStyle w:val="Ttulo2Car"/>
@@ -2567,7 +2409,7 @@
       <w:pPr>
         <w:pStyle w:val="Ttulo3"/>
       </w:pPr>
-      <w:bookmarkStart w:id="4" w:name="_Toc229548790"/>
+      <w:bookmarkStart w:id="4" w:name="_Toc229564264"/>
       <w:r>
         <w:t>Solución:</w:t>
       </w:r>
@@ -2737,7 +2579,6 @@
           <w:b/>
           <w:bCs/>
         </w:rPr>
-        <w:lastRenderedPageBreak/>
         <w:t xml:space="preserve">Atributo multivaluado </w:t>
       </w:r>
       <w:r>
@@ -2810,6 +2651,7 @@
         <w:rPr>
           <w:noProof/>
         </w:rPr>
+        <w:lastRenderedPageBreak/>
         <w:drawing>
           <wp:inline distT="0" distB="0" distL="0" distR="0" wp14:anchorId="24A1807E" wp14:editId="4934A9FF">
             <wp:extent cx="4142105" cy="3113405"/>
@@ -2868,7 +2710,7 @@
           <w:numId w:val="9"/>
         </w:numPr>
       </w:pPr>
-      <w:bookmarkStart w:id="5" w:name="_Toc229548791"/>
+      <w:bookmarkStart w:id="5" w:name="_Toc229564265"/>
       <w:r>
         <w:t>Modelar Relaciones</w:t>
       </w:r>
@@ -2880,7 +2722,7 @@
           <w:rStyle w:val="Ttulo2Car"/>
         </w:rPr>
       </w:pPr>
-      <w:bookmarkStart w:id="6" w:name="_Toc229548792"/>
+      <w:bookmarkStart w:id="6" w:name="_Toc229564266"/>
       <w:r>
         <w:rPr>
           <w:rStyle w:val="Ttulo2Car"/>
@@ -2906,7 +2748,7 @@
       <w:pPr>
         <w:pStyle w:val="Ttulo3"/>
       </w:pPr>
-      <w:bookmarkStart w:id="7" w:name="_Toc229548793"/>
+      <w:bookmarkStart w:id="7" w:name="_Toc229564267"/>
       <w:r>
         <w:t>Solución:</w:t>
       </w:r>
@@ -2982,20 +2824,77 @@
           <w:b/>
           <w:bCs/>
         </w:rPr>
+        <w:t>Entidad:</w:t>
+      </w:r>
+      <w:r>
+        <w:t xml:space="preserve"> Puesto</w:t>
+      </w:r>
+    </w:p>
+    <w:p>
+      <w:r>
+        <w:rPr>
+          <w:b/>
+          <w:bCs/>
+        </w:rPr>
+        <w:t xml:space="preserve">Clave Primaria (PK): </w:t>
+      </w:r>
+      <w:proofErr w:type="spellStart"/>
+      <w:r>
+        <w:rPr>
+          <w:b/>
+          <w:bCs/>
+        </w:rPr>
+        <w:t>código_identificacion</w:t>
+      </w:r>
+      <w:proofErr w:type="spellEnd"/>
+      <w:r>
+        <w:t xml:space="preserve"> (identificación única)</w:t>
+      </w:r>
+    </w:p>
+    <w:p>
+      <w:r>
+        <w:rPr>
+          <w:b/>
+          <w:bCs/>
+        </w:rPr>
+        <w:t xml:space="preserve">Atributo Simple </w:t>
+      </w:r>
+      <w:proofErr w:type="spellStart"/>
+      <w:r>
+        <w:rPr>
+          <w:b/>
+          <w:bCs/>
+        </w:rPr>
+        <w:t>GradoDePeligrosidad</w:t>
+      </w:r>
+      <w:proofErr w:type="spellEnd"/>
+      <w:r>
+        <w:rPr>
+          <w:b/>
+          <w:bCs/>
+        </w:rPr>
+        <w:t>:</w:t>
+      </w:r>
+      <w:r>
+        <w:t xml:space="preserve"> (valor </w:t>
+      </w:r>
+      <w:proofErr w:type="spellStart"/>
+      <w:r>
+        <w:t>numerico</w:t>
+      </w:r>
+      <w:proofErr w:type="spellEnd"/>
+      <w:r>
+        <w:t xml:space="preserve"> restringido de 0 a 10)</w:t>
+      </w:r>
+    </w:p>
+    <w:p>
+      <w:r>
+        <w:rPr>
+          <w:b/>
+          <w:bCs/>
+        </w:rPr>
         <w:lastRenderedPageBreak/>
-        <w:t>Entidad:</w:t>
-      </w:r>
-      <w:r>
-        <w:t xml:space="preserve"> Puesto</w:t>
-      </w:r>
-    </w:p>
-    <w:p>
-      <w:r>
-        <w:rPr>
-          <w:b/>
-          <w:bCs/>
-        </w:rPr>
-        <w:t xml:space="preserve">Clave Primaria (PK): </w:t>
+        <w:t xml:space="preserve">Atributo Simple </w:t>
       </w:r>
       <w:proofErr w:type="spellStart"/>
       <w:r>
@@ -3003,31 +2902,10 @@
           <w:b/>
           <w:bCs/>
         </w:rPr>
-        <w:t>código_identificacion</w:t>
+        <w:t>SueldoDeReferencia</w:t>
       </w:r>
       <w:proofErr w:type="spellEnd"/>
       <w:r>
-        <w:t xml:space="preserve"> (identificación única)</w:t>
-      </w:r>
-    </w:p>
-    <w:p>
-      <w:r>
-        <w:rPr>
-          <w:b/>
-          <w:bCs/>
-        </w:rPr>
-        <w:t xml:space="preserve">Atributo Simple </w:t>
-      </w:r>
-      <w:proofErr w:type="spellStart"/>
-      <w:r>
-        <w:rPr>
-          <w:b/>
-          <w:bCs/>
-        </w:rPr>
-        <w:t>GradoDePeligrosidad</w:t>
-      </w:r>
-      <w:proofErr w:type="spellEnd"/>
-      <w:r>
         <w:rPr>
           <w:b/>
           <w:bCs/>
@@ -3035,42 +2913,6 @@
         <w:t>:</w:t>
       </w:r>
       <w:r>
-        <w:t xml:space="preserve"> (valor </w:t>
-      </w:r>
-      <w:proofErr w:type="spellStart"/>
-      <w:r>
-        <w:t>numerico</w:t>
-      </w:r>
-      <w:proofErr w:type="spellEnd"/>
-      <w:r>
-        <w:t xml:space="preserve"> restringido de 0 a 10)</w:t>
-      </w:r>
-    </w:p>
-    <w:p>
-      <w:r>
-        <w:rPr>
-          <w:b/>
-          <w:bCs/>
-        </w:rPr>
-        <w:t xml:space="preserve">Atributo Simple </w:t>
-      </w:r>
-      <w:proofErr w:type="spellStart"/>
-      <w:r>
-        <w:rPr>
-          <w:b/>
-          <w:bCs/>
-        </w:rPr>
-        <w:t>SueldoDeReferencia</w:t>
-      </w:r>
-      <w:proofErr w:type="spellEnd"/>
-      <w:r>
-        <w:rPr>
-          <w:b/>
-          <w:bCs/>
-        </w:rPr>
-        <w:t>:</w:t>
-      </w:r>
-      <w:r>
         <w:t xml:space="preserve"> (salario SMMLV del puesto)</w:t>
       </w:r>
     </w:p>
@@ -3078,7 +2920,7 @@
       <w:pPr>
         <w:pStyle w:val="Ttulo3"/>
       </w:pPr>
-      <w:bookmarkStart w:id="8" w:name="_Toc229548794"/>
+      <w:bookmarkStart w:id="8" w:name="_Toc229564268"/>
       <w:r>
         <w:t>Relaciones:</w:t>
       </w:r>
@@ -3239,7 +3081,7 @@
     </w:p>
     <w:p/>
     <w:p>
-      <w:bookmarkStart w:id="9" w:name="_Toc229548795"/>
+      <w:bookmarkStart w:id="9" w:name="_Toc229564269"/>
       <w:r>
         <w:rPr>
           <w:rStyle w:val="Ttulo2Car"/>
@@ -3348,86 +3190,86 @@
     </w:p>
     <w:p>
       <w:r>
+        <w:t xml:space="preserve"> </w:t>
+      </w:r>
+      <w:r>
+        <w:rPr>
+          <w:rFonts w:ascii="Segoe UI Symbol" w:hAnsi="Segoe UI Symbol" w:cs="Segoe UI Symbol"/>
+        </w:rPr>
+        <w:t>✓</w:t>
+      </w:r>
+      <w:r>
+        <w:t xml:space="preserve"> Un docente es compa</w:t>
+      </w:r>
+      <w:r>
+        <w:rPr>
+          <w:rFonts w:ascii="Calibri" w:hAnsi="Calibri" w:cs="Calibri"/>
+        </w:rPr>
+        <w:t>ñ</w:t>
+      </w:r>
+      <w:r>
+        <w:t>ero de otros docentes; para cada docente compa</w:t>
+      </w:r>
+      <w:r>
+        <w:rPr>
+          <w:rFonts w:ascii="Calibri" w:hAnsi="Calibri" w:cs="Calibri"/>
+        </w:rPr>
+        <w:t>ñ</w:t>
+      </w:r>
+      <w:r>
+        <w:t>ero la relaci</w:t>
+      </w:r>
+      <w:r>
+        <w:rPr>
+          <w:rFonts w:ascii="Calibri" w:hAnsi="Calibri" w:cs="Calibri"/>
+        </w:rPr>
+        <w:t>ó</w:t>
+      </w:r>
+      <w:r>
+        <w:t>n se da en algunos (uno o varios) meses del a</w:t>
+      </w:r>
+      <w:r>
+        <w:rPr>
+          <w:rFonts w:ascii="Calibri" w:hAnsi="Calibri" w:cs="Calibri"/>
+        </w:rPr>
+        <w:t>ñ</w:t>
+      </w:r>
+      <w:r>
+        <w:t>o.</w:t>
+      </w:r>
+    </w:p>
+    <w:p>
+      <w:pPr>
+        <w:pStyle w:val="Ttulo3"/>
+      </w:pPr>
+      <w:bookmarkStart w:id="10" w:name="_Toc229564270"/>
+      <w:r>
+        <w:t>Solución</w:t>
+      </w:r>
+      <w:bookmarkEnd w:id="10"/>
+    </w:p>
+    <w:p>
+      <w:pPr>
+        <w:rPr>
+          <w:b/>
+          <w:bCs/>
+        </w:rPr>
+      </w:pPr>
+      <w:r>
+        <w:rPr>
+          <w:b/>
+          <w:bCs/>
+        </w:rPr>
+        <w:t>Entidad: docente</w:t>
+      </w:r>
+    </w:p>
+    <w:p>
+      <w:r>
+        <w:rPr>
+          <w:b/>
+          <w:bCs/>
+        </w:rPr>
         <w:lastRenderedPageBreak/>
-        <w:t xml:space="preserve"> </w:t>
-      </w:r>
-      <w:r>
-        <w:rPr>
-          <w:rFonts w:ascii="Segoe UI Symbol" w:hAnsi="Segoe UI Symbol" w:cs="Segoe UI Symbol"/>
-        </w:rPr>
-        <w:t>✓</w:t>
-      </w:r>
-      <w:r>
-        <w:t xml:space="preserve"> Un docente es compa</w:t>
-      </w:r>
-      <w:r>
-        <w:rPr>
-          <w:rFonts w:ascii="Calibri" w:hAnsi="Calibri" w:cs="Calibri"/>
-        </w:rPr>
-        <w:t>ñ</w:t>
-      </w:r>
-      <w:r>
-        <w:t>ero de otros docentes; para cada docente compa</w:t>
-      </w:r>
-      <w:r>
-        <w:rPr>
-          <w:rFonts w:ascii="Calibri" w:hAnsi="Calibri" w:cs="Calibri"/>
-        </w:rPr>
-        <w:t>ñ</w:t>
-      </w:r>
-      <w:r>
-        <w:t>ero la relaci</w:t>
-      </w:r>
-      <w:r>
-        <w:rPr>
-          <w:rFonts w:ascii="Calibri" w:hAnsi="Calibri" w:cs="Calibri"/>
-        </w:rPr>
-        <w:t>ó</w:t>
-      </w:r>
-      <w:r>
-        <w:t>n se da en algunos (uno o varios) meses del a</w:t>
-      </w:r>
-      <w:r>
-        <w:rPr>
-          <w:rFonts w:ascii="Calibri" w:hAnsi="Calibri" w:cs="Calibri"/>
-        </w:rPr>
-        <w:t>ñ</w:t>
-      </w:r>
-      <w:r>
-        <w:t>o.</w:t>
-      </w:r>
-    </w:p>
-    <w:p>
-      <w:pPr>
-        <w:pStyle w:val="Ttulo3"/>
-      </w:pPr>
-      <w:bookmarkStart w:id="10" w:name="_Toc229548796"/>
-      <w:r>
-        <w:t>Solución</w:t>
-      </w:r>
-      <w:bookmarkEnd w:id="10"/>
-    </w:p>
-    <w:p>
-      <w:pPr>
-        <w:rPr>
-          <w:b/>
-          <w:bCs/>
-        </w:rPr>
-      </w:pPr>
-      <w:r>
-        <w:rPr>
-          <w:b/>
-          <w:bCs/>
-        </w:rPr>
-        <w:t>Entidad: docente</w:t>
-      </w:r>
-    </w:p>
-    <w:p>
-      <w:r>
-        <w:rPr>
-          <w:b/>
-          <w:bCs/>
-        </w:rPr>
         <w:t>Llave Primaria (PK)</w:t>
       </w:r>
       <w:r>
@@ -3707,7 +3549,6 @@
           <w:b/>
           <w:bCs/>
         </w:rPr>
-        <w:lastRenderedPageBreak/>
         <w:t xml:space="preserve">Atributo Simple </w:t>
       </w:r>
       <w:proofErr w:type="spellStart"/>
@@ -3766,6 +3607,7 @@
           <w:sz w:val="28"/>
           <w:szCs w:val="28"/>
         </w:rPr>
+        <w:lastRenderedPageBreak/>
         <w:drawing>
           <wp:inline distT="0" distB="0" distL="0" distR="0" wp14:anchorId="7D61CE53" wp14:editId="2C35320D">
             <wp:extent cx="5610860" cy="3061970"/>
@@ -3904,15 +3746,15 @@
         <w:pStyle w:val="Subttulo"/>
       </w:pPr>
       <w:r>
+        <w:t>Caso 4: relación recursiva con tiempo(meses)</w:t>
+      </w:r>
+    </w:p>
+    <w:p>
+      <w:r>
+        <w:rPr>
+          <w:noProof/>
+        </w:rPr>
         <w:lastRenderedPageBreak/>
-        <w:t>Caso 4: relación recursiva con tiempo(meses)</w:t>
-      </w:r>
-    </w:p>
-    <w:p>
-      <w:r>
-        <w:rPr>
-          <w:noProof/>
-        </w:rPr>
         <w:drawing>
           <wp:inline distT="0" distB="0" distL="0" distR="0" wp14:anchorId="79CD4801" wp14:editId="75F77B26">
             <wp:extent cx="2403475" cy="1724660"/>
@@ -3967,7 +3809,7 @@
       <w:pPr>
         <w:pStyle w:val="Ttulo1"/>
       </w:pPr>
-      <w:bookmarkStart w:id="11" w:name="_Toc229548797"/>
+      <w:bookmarkStart w:id="11" w:name="_Toc229564271"/>
       <w:r>
         <w:t>Enunciado 1:</w:t>
       </w:r>
@@ -4054,20 +3896,20 @@
       <w:pPr>
         <w:pStyle w:val="Ttulo2"/>
       </w:pPr>
-      <w:bookmarkStart w:id="12" w:name="_Toc229548798"/>
+      <w:bookmarkStart w:id="12" w:name="_Toc229564272"/>
+      <w:r>
+        <w:t>Solución:</w:t>
+      </w:r>
+      <w:bookmarkEnd w:id="12"/>
+    </w:p>
+    <w:p/>
+    <w:p>
+      <w:pPr>
+        <w:pStyle w:val="Ttulo3"/>
+      </w:pPr>
+      <w:bookmarkStart w:id="13" w:name="_Toc229564273"/>
       <w:r>
         <w:lastRenderedPageBreak/>
-        <w:t>Solución:</w:t>
-      </w:r>
-      <w:bookmarkEnd w:id="12"/>
-    </w:p>
-    <w:p/>
-    <w:p>
-      <w:pPr>
-        <w:pStyle w:val="Ttulo3"/>
-      </w:pPr>
-      <w:bookmarkStart w:id="13" w:name="_Toc229548799"/>
-      <w:r>
         <w:t>Entidades Administrativas y de Personal</w:t>
       </w:r>
       <w:bookmarkEnd w:id="13"/>
@@ -4416,7 +4258,7 @@
       <w:pPr>
         <w:pStyle w:val="Ttulo3"/>
       </w:pPr>
-      <w:bookmarkStart w:id="14" w:name="_Toc229548800"/>
+      <w:bookmarkStart w:id="14" w:name="_Toc229564274"/>
       <w:r>
         <w:t>Entidades de Productos y Laboratorios</w:t>
       </w:r>
@@ -4523,59 +4365,59 @@
           <w:b/>
           <w:bCs/>
         </w:rPr>
+        <w:t xml:space="preserve">Atributo </w:t>
+      </w:r>
+      <w:r>
+        <w:rPr>
+          <w:b/>
+          <w:bCs/>
+        </w:rPr>
+        <w:t>Compuesto</w:t>
+      </w:r>
+      <w:r>
+        <w:rPr>
+          <w:b/>
+          <w:bCs/>
+        </w:rPr>
+        <w:t xml:space="preserve"> Domicilio:</w:t>
+      </w:r>
+      <w:r>
+        <w:rPr>
+          <w:b/>
+          <w:bCs/>
+        </w:rPr>
+        <w:t xml:space="preserve"> (</w:t>
+      </w:r>
+      <w:r>
+        <w:t xml:space="preserve">por que tiene </w:t>
+      </w:r>
+      <w:r>
+        <w:t>dirección</w:t>
+      </w:r>
+      <w:r>
+        <w:t xml:space="preserve"> y numero de teléfono</w:t>
+      </w:r>
+      <w:r>
+        <w:rPr>
+          <w:b/>
+          <w:bCs/>
+        </w:rPr>
+        <w:t>)</w:t>
+      </w:r>
+    </w:p>
+    <w:p>
+      <w:pPr>
+        <w:rPr>
+          <w:b/>
+          <w:bCs/>
+        </w:rPr>
+      </w:pPr>
+      <w:r>
+        <w:rPr>
+          <w:b/>
+          <w:bCs/>
+        </w:rPr>
         <w:lastRenderedPageBreak/>
-        <w:t xml:space="preserve">Atributo </w:t>
-      </w:r>
-      <w:r>
-        <w:rPr>
-          <w:b/>
-          <w:bCs/>
-        </w:rPr>
-        <w:t>Compuesto</w:t>
-      </w:r>
-      <w:r>
-        <w:rPr>
-          <w:b/>
-          <w:bCs/>
-        </w:rPr>
-        <w:t xml:space="preserve"> Domicilio:</w:t>
-      </w:r>
-      <w:r>
-        <w:rPr>
-          <w:b/>
-          <w:bCs/>
-        </w:rPr>
-        <w:t xml:space="preserve"> (</w:t>
-      </w:r>
-      <w:r>
-        <w:t xml:space="preserve">por que tiene </w:t>
-      </w:r>
-      <w:r>
-        <w:t>dirección</w:t>
-      </w:r>
-      <w:r>
-        <w:t xml:space="preserve"> y numero de teléfono</w:t>
-      </w:r>
-      <w:r>
-        <w:rPr>
-          <w:b/>
-          <w:bCs/>
-        </w:rPr>
-        <w:t>)</w:t>
-      </w:r>
-    </w:p>
-    <w:p>
-      <w:pPr>
-        <w:rPr>
-          <w:b/>
-          <w:bCs/>
-        </w:rPr>
-      </w:pPr>
-      <w:r>
-        <w:rPr>
-          <w:b/>
-          <w:bCs/>
-        </w:rPr>
         <w:t>Atributo Compuesto dueño: (</w:t>
       </w:r>
       <w:proofErr w:type="spellStart"/>
@@ -4690,32 +4532,1008 @@
         <w:t>Atributo Compuesto Tiempo</w:t>
       </w:r>
       <w:r>
-        <w:t xml:space="preserve"> (Tiempo que tarda en hacer efecto como Horas, Días) </w:t>
-      </w:r>
-    </w:p>
-    <w:p>
-      <w:pPr>
-        <w:rPr>
-          <w:b/>
-          <w:bCs/>
-        </w:rPr>
-      </w:pPr>
-    </w:p>
-    <w:p>
-      <w:pPr>
-        <w:rPr>
-          <w:b/>
-          <w:bCs/>
-        </w:rPr>
-      </w:pPr>
-    </w:p>
-    <w:p>
-      <w:pPr>
-        <w:rPr>
-          <w:b/>
-          <w:bCs/>
-        </w:rPr>
-      </w:pPr>
+        <w:t xml:space="preserve"> (Tiempo que tarda en hacer efecto como Horas, Días)</w:t>
+      </w:r>
+    </w:p>
+    <w:p>
+      <w:pPr>
+        <w:pStyle w:val="Ttulo3"/>
+      </w:pPr>
+      <w:r>
+        <w:t>Entidades intermedias</w:t>
+      </w:r>
+      <w:r>
+        <w:t xml:space="preserve"> </w:t>
+      </w:r>
+    </w:p>
+    <w:p/>
+    <w:p>
+      <w:r>
+        <w:rPr>
+          <w:b/>
+          <w:bCs/>
+        </w:rPr>
+        <w:t>Entidad:</w:t>
+      </w:r>
+      <w:r>
+        <w:t xml:space="preserve"> stock</w:t>
+      </w:r>
+    </w:p>
+    <w:p>
+      <w:pPr>
+        <w:rPr>
+          <w:b/>
+          <w:bCs/>
+        </w:rPr>
+      </w:pPr>
+      <w:r>
+        <w:rPr>
+          <w:b/>
+          <w:bCs/>
+        </w:rPr>
+        <w:t>Llave Primaria Compuesta (PK):</w:t>
+      </w:r>
+      <w:r>
+        <w:rPr>
+          <w:b/>
+          <w:bCs/>
+        </w:rPr>
+        <w:t xml:space="preserve"> </w:t>
+      </w:r>
+    </w:p>
+    <w:p>
+      <w:r>
+        <w:t xml:space="preserve">id </w:t>
+      </w:r>
+    </w:p>
+    <w:p>
+      <w:proofErr w:type="spellStart"/>
+      <w:r>
+        <w:t>Nombre+Presentacion</w:t>
+      </w:r>
+      <w:proofErr w:type="spellEnd"/>
+    </w:p>
+    <w:p>
+      <w:pPr>
+        <w:rPr>
+          <w:b/>
+          <w:bCs/>
+        </w:rPr>
+      </w:pPr>
+      <w:r>
+        <w:rPr>
+          <w:b/>
+          <w:bCs/>
+        </w:rPr>
+        <w:t>Atributo</w:t>
+      </w:r>
+      <w:r>
+        <w:rPr>
+          <w:b/>
+          <w:bCs/>
+        </w:rPr>
+        <w:t xml:space="preserve"> Simple</w:t>
+      </w:r>
+      <w:r>
+        <w:rPr>
+          <w:b/>
+          <w:bCs/>
+        </w:rPr>
+        <w:t xml:space="preserve"> </w:t>
+      </w:r>
+      <w:proofErr w:type="spellStart"/>
+      <w:r>
+        <w:rPr>
+          <w:b/>
+          <w:bCs/>
+        </w:rPr>
+        <w:t>cantidad_stock</w:t>
+      </w:r>
+      <w:proofErr w:type="spellEnd"/>
+    </w:p>
+    <w:p>
+      <w:r>
+        <w:rPr>
+          <w:b/>
+          <w:bCs/>
+        </w:rPr>
+        <w:t>Entidad:</w:t>
+      </w:r>
+      <w:r>
+        <w:t xml:space="preserve"> </w:t>
+      </w:r>
+      <w:proofErr w:type="spellStart"/>
+      <w:r>
+        <w:t>empleado_enfermedad</w:t>
+      </w:r>
+      <w:proofErr w:type="spellEnd"/>
+    </w:p>
+    <w:p>
+      <w:pPr>
+        <w:rPr>
+          <w:b/>
+          <w:bCs/>
+        </w:rPr>
+      </w:pPr>
+      <w:r>
+        <w:rPr>
+          <w:b/>
+          <w:bCs/>
+        </w:rPr>
+        <w:t>Llave primaria compuesta (PK):</w:t>
+      </w:r>
+    </w:p>
+    <w:p>
+      <w:r>
+        <w:t>CUIT</w:t>
+      </w:r>
+    </w:p>
+    <w:p>
+      <w:r>
+        <w:t>Enfermedad</w:t>
+      </w:r>
+    </w:p>
+    <w:p>
+      <w:r>
+        <w:rPr>
+          <w:b/>
+          <w:bCs/>
+        </w:rPr>
+        <w:t>Entidad:</w:t>
+      </w:r>
+      <w:r>
+        <w:t xml:space="preserve"> </w:t>
+      </w:r>
+      <w:proofErr w:type="spellStart"/>
+      <w:r>
+        <w:t>medicamento_monofroga</w:t>
+      </w:r>
+      <w:proofErr w:type="spellEnd"/>
+    </w:p>
+    <w:p>
+      <w:pPr>
+        <w:rPr>
+          <w:b/>
+          <w:bCs/>
+        </w:rPr>
+      </w:pPr>
+      <w:r>
+        <w:rPr>
+          <w:b/>
+          <w:bCs/>
+        </w:rPr>
+        <w:t>Llave Primaria Compuesta (PK):</w:t>
+      </w:r>
+    </w:p>
+    <w:p>
+      <w:proofErr w:type="spellStart"/>
+      <w:r>
+        <w:t>Nombre+Presentacion</w:t>
+      </w:r>
+      <w:proofErr w:type="spellEnd"/>
+    </w:p>
+    <w:p>
+      <w:proofErr w:type="spellStart"/>
+      <w:r>
+        <w:t>nombreCientifico</w:t>
+      </w:r>
+      <w:proofErr w:type="spellEnd"/>
+    </w:p>
+    <w:p>
+      <w:r>
+        <w:rPr>
+          <w:b/>
+          <w:bCs/>
+        </w:rPr>
+        <w:t>Atributo Simple Cantidad</w:t>
+      </w:r>
+    </w:p>
+    <w:p>
+      <w:r>
+        <w:rPr>
+          <w:b/>
+          <w:bCs/>
+        </w:rPr>
+        <w:t>Entidad:</w:t>
+      </w:r>
+      <w:r>
+        <w:t xml:space="preserve"> medicamento acción </w:t>
+      </w:r>
+    </w:p>
+    <w:p>
+      <w:pPr>
+        <w:rPr>
+          <w:b/>
+          <w:bCs/>
+        </w:rPr>
+      </w:pPr>
+      <w:r>
+        <w:rPr>
+          <w:b/>
+          <w:bCs/>
+        </w:rPr>
+        <w:t>Llave primaria compuesta (PK):</w:t>
+      </w:r>
+    </w:p>
+    <w:p>
+      <w:proofErr w:type="spellStart"/>
+      <w:r>
+        <w:t>Nombre+Presentacion</w:t>
+      </w:r>
+      <w:proofErr w:type="spellEnd"/>
+    </w:p>
+    <w:p>
+      <w:r>
+        <w:t>Nombre</w:t>
+      </w:r>
+    </w:p>
+    <w:p>
+      <w:r>
+        <w:rPr>
+          <w:b/>
+          <w:bCs/>
+        </w:rPr>
+        <w:t>Atributo Compuesto</w:t>
+      </w:r>
+      <w:r>
+        <w:rPr>
+          <w:b/>
+          <w:bCs/>
+        </w:rPr>
+        <w:t xml:space="preserve"> tiempo</w:t>
+      </w:r>
+      <w:r>
+        <w:rPr>
+          <w:b/>
+          <w:bCs/>
+        </w:rPr>
+        <w:t>:</w:t>
+      </w:r>
+      <w:r>
+        <w:rPr>
+          <w:b/>
+          <w:bCs/>
+        </w:rPr>
+        <w:t xml:space="preserve"> </w:t>
+      </w:r>
+      <w:r>
+        <w:t>Hora</w:t>
+      </w:r>
+      <w:r>
+        <w:t xml:space="preserve"> </w:t>
+      </w:r>
+      <w:r>
+        <w:t>días</w:t>
+      </w:r>
+    </w:p>
+    <w:p>
+      <w:r>
+        <w:rPr>
+          <w:noProof/>
+        </w:rPr>
+        <w:lastRenderedPageBreak/>
+        <w:drawing>
+          <wp:inline distT="0" distB="0" distL="0" distR="0" wp14:anchorId="2AE9C873" wp14:editId="19E70F3A">
+            <wp:extent cx="5603875" cy="4142740"/>
+            <wp:effectExtent l="0" t="0" r="0" b="0"/>
+            <wp:docPr id="1421001465" name="Imagen 1"/>
+            <wp:cNvGraphicFramePr>
+              <a:graphicFrameLocks xmlns:a="http://schemas.openxmlformats.org/drawingml/2006/main" noChangeAspect="1"/>
+            </wp:cNvGraphicFramePr>
+            <a:graphic xmlns:a="http://schemas.openxmlformats.org/drawingml/2006/main">
+              <a:graphicData uri="http://schemas.openxmlformats.org/drawingml/2006/picture">
+                <pic:pic xmlns:pic="http://schemas.openxmlformats.org/drawingml/2006/picture">
+                  <pic:nvPicPr>
+                    <pic:cNvPr id="0" name="Picture 1"/>
+                    <pic:cNvPicPr>
+                      <a:picLocks noChangeAspect="1" noChangeArrowheads="1"/>
+                    </pic:cNvPicPr>
+                  </pic:nvPicPr>
+                  <pic:blipFill>
+                    <a:blip r:embed="rId14">
+                      <a:extLst>
+                        <a:ext uri="{28A0092B-C50C-407E-A947-70E740481C1C}">
+                          <a14:useLocalDpi xmlns:a14="http://schemas.microsoft.com/office/drawing/2010/main" val="0"/>
+                        </a:ext>
+                      </a:extLst>
+                    </a:blip>
+                    <a:srcRect/>
+                    <a:stretch>
+                      <a:fillRect/>
+                    </a:stretch>
+                  </pic:blipFill>
+                  <pic:spPr bwMode="auto">
+                    <a:xfrm>
+                      <a:off x="0" y="0"/>
+                      <a:ext cx="5603875" cy="4142740"/>
+                    </a:xfrm>
+                    <a:prstGeom prst="rect">
+                      <a:avLst/>
+                    </a:prstGeom>
+                    <a:noFill/>
+                    <a:ln>
+                      <a:noFill/>
+                    </a:ln>
+                  </pic:spPr>
+                </pic:pic>
+              </a:graphicData>
+            </a:graphic>
+          </wp:inline>
+        </w:drawing>
+      </w:r>
+    </w:p>
+    <w:p/>
+    <w:p/>
+    <w:p>
+      <w:pPr>
+        <w:pStyle w:val="Ttulo1"/>
+      </w:pPr>
+      <w:r>
+        <w:t xml:space="preserve">Enunciado 2 </w:t>
+      </w:r>
+    </w:p>
+    <w:p>
+      <w:r>
+        <w:t xml:space="preserve">Cupones de Descuento </w:t>
+      </w:r>
+    </w:p>
+    <w:p>
+      <w:r>
+        <w:t xml:space="preserve">De los Cupones se conoce su número (que es único en el sistema), el importe de descuento, su fecha y hora de vencimiento. Cada cupón está asociado a un solo Producto que puede ser ofrecido por varios Proveedores. Del Producto, sabemos su código (que es único para el Proveedor que lo tiene, pero podría repetirse para distintos proveedores), el precio de venta y sus dimensiones (que se componen por alto, ancho, profundidad y peso). Del Proveedor conocemos su CUIT, razón social y un listado de teléfonos de atención al cliente. Cada proveedor puede proveer varios productos. Sabemos además que pueden existir más de un Cupón por Producto. Los Cupones son comprados por lo que la empresa denomina Clientes. Como los Clientes pueden comprar más de un Cupón (y de hecho pueden comprar más de un mismo Cupón) por cada Cupón comprado por un Cliente se requiere guardar la fecha y hora de compra (como la precisión de la hora es al segundo, no existen más de una compra en el mismo segundo) y la forma de pago. De los Clientes </w:t>
+      </w:r>
+      <w:r>
+        <w:lastRenderedPageBreak/>
+        <w:t xml:space="preserve">se conocen: su DNI, nombre completo, un email y varios teléfonos de contacto (los cuales se componen por el código de área y el número de teléfono propiamente dicho). Tenga en cuenta que un cupón que puede no haber sido comprado por ningún cliente. También existen lo que se llama </w:t>
+      </w:r>
+      <w:proofErr w:type="spellStart"/>
+      <w:r>
+        <w:t>SuperCupón</w:t>
+      </w:r>
+      <w:proofErr w:type="spellEnd"/>
+      <w:r>
+        <w:t xml:space="preserve">, que básicamente es un Cupón que está asociado con otro Cupón y permite tener un super descuento sobre el Producto asociado. Un </w:t>
+      </w:r>
+      <w:proofErr w:type="spellStart"/>
+      <w:r>
+        <w:t>SuperCupón</w:t>
+      </w:r>
+      <w:proofErr w:type="spellEnd"/>
+      <w:r>
+        <w:t xml:space="preserve"> está asociado a otro cupón y no puede aplicar a más de uno; tener en cuenta que no todos los Cupones están asociados a Super-Cupones.</w:t>
+      </w:r>
+    </w:p>
+    <w:p>
+      <w:pPr>
+        <w:pStyle w:val="Ttulo3"/>
+      </w:pPr>
+      <w:r>
+        <w:t>Solución:</w:t>
+      </w:r>
+    </w:p>
+    <w:p/>
+    <w:p>
+      <w:pPr>
+        <w:pStyle w:val="Ttulo3"/>
+      </w:pPr>
+      <w:r>
+        <w:t>entidades</w:t>
+      </w:r>
+    </w:p>
+    <w:p>
+      <w:r>
+        <w:rPr>
+          <w:b/>
+          <w:bCs/>
+        </w:rPr>
+        <w:t>E</w:t>
+      </w:r>
+      <w:r>
+        <w:rPr>
+          <w:b/>
+          <w:bCs/>
+        </w:rPr>
+        <w:t>ntidad:</w:t>
+      </w:r>
+      <w:r>
+        <w:t xml:space="preserve"> </w:t>
+      </w:r>
+      <w:r>
+        <w:t>cupón</w:t>
+      </w:r>
+    </w:p>
+    <w:p>
+      <w:r>
+        <w:rPr>
+          <w:b/>
+          <w:bCs/>
+        </w:rPr>
+        <w:t xml:space="preserve">Llave principal (PK) </w:t>
+      </w:r>
+      <w:proofErr w:type="spellStart"/>
+      <w:r>
+        <w:rPr>
+          <w:b/>
+          <w:bCs/>
+        </w:rPr>
+        <w:t>numeroCupon</w:t>
+      </w:r>
+      <w:proofErr w:type="spellEnd"/>
+      <w:r>
+        <w:t xml:space="preserve"> (</w:t>
+      </w:r>
+      <w:proofErr w:type="spellStart"/>
+      <w:r>
+        <w:t>numero</w:t>
+      </w:r>
+      <w:proofErr w:type="spellEnd"/>
+      <w:r>
+        <w:t xml:space="preserve"> único del </w:t>
+      </w:r>
+      <w:proofErr w:type="spellStart"/>
+      <w:r>
+        <w:t>cupon</w:t>
+      </w:r>
+      <w:proofErr w:type="spellEnd"/>
+      <w:r>
+        <w:t>)</w:t>
+      </w:r>
+    </w:p>
+    <w:p>
+      <w:r>
+        <w:rPr>
+          <w:b/>
+          <w:bCs/>
+        </w:rPr>
+        <w:t xml:space="preserve">Atributo Simple </w:t>
+      </w:r>
+      <w:proofErr w:type="spellStart"/>
+      <w:r>
+        <w:rPr>
+          <w:b/>
+          <w:bCs/>
+        </w:rPr>
+        <w:t>importeDescuento</w:t>
+      </w:r>
+      <w:proofErr w:type="spellEnd"/>
+      <w:r>
+        <w:t xml:space="preserve"> (valor del descuento)</w:t>
+      </w:r>
+    </w:p>
+    <w:p>
+      <w:r>
+        <w:rPr>
+          <w:b/>
+          <w:bCs/>
+        </w:rPr>
+        <w:t xml:space="preserve">Atributo Simple </w:t>
+      </w:r>
+      <w:proofErr w:type="spellStart"/>
+      <w:r>
+        <w:rPr>
+          <w:b/>
+          <w:bCs/>
+        </w:rPr>
+        <w:t>fechaHoraVencimiento</w:t>
+      </w:r>
+      <w:proofErr w:type="spellEnd"/>
+      <w:r>
+        <w:t xml:space="preserve"> (fecha y hora de vencimiento)</w:t>
+      </w:r>
+    </w:p>
+    <w:p>
+      <w:r>
+        <w:rPr>
+          <w:b/>
+          <w:bCs/>
+        </w:rPr>
+        <w:t>Entidad:</w:t>
+      </w:r>
+      <w:r>
+        <w:t xml:space="preserve"> producto</w:t>
+      </w:r>
+    </w:p>
+    <w:p>
+      <w:r>
+        <w:rPr>
+          <w:b/>
+          <w:bCs/>
+        </w:rPr>
+        <w:t xml:space="preserve">Llave primaria (PK) </w:t>
+      </w:r>
+      <w:proofErr w:type="spellStart"/>
+      <w:r>
+        <w:rPr>
+          <w:b/>
+          <w:bCs/>
+        </w:rPr>
+        <w:t>codigoProducto</w:t>
+      </w:r>
+      <w:proofErr w:type="spellEnd"/>
+      <w:r>
+        <w:t xml:space="preserve"> (código del producto único)</w:t>
+      </w:r>
+    </w:p>
+    <w:p>
+      <w:r>
+        <w:rPr>
+          <w:b/>
+          <w:bCs/>
+        </w:rPr>
+        <w:t xml:space="preserve">Atributo Simple </w:t>
+      </w:r>
+      <w:proofErr w:type="spellStart"/>
+      <w:r>
+        <w:rPr>
+          <w:b/>
+          <w:bCs/>
+        </w:rPr>
+        <w:t>precioVenta</w:t>
+      </w:r>
+      <w:proofErr w:type="spellEnd"/>
+      <w:r>
+        <w:t xml:space="preserve"> (precio del producto)</w:t>
+      </w:r>
+    </w:p>
+    <w:p>
+      <w:r>
+        <w:rPr>
+          <w:b/>
+          <w:bCs/>
+        </w:rPr>
+        <w:t>Atributo compuesto dimensiones</w:t>
+      </w:r>
+      <w:r>
+        <w:t xml:space="preserve"> </w:t>
+      </w:r>
+      <w:proofErr w:type="gramStart"/>
+      <w:r>
+        <w:t>( dimensiones</w:t>
+      </w:r>
+      <w:proofErr w:type="gramEnd"/>
+      <w:r>
+        <w:t xml:space="preserve"> posee alto, ancho, profundidad, peso)</w:t>
+      </w:r>
+    </w:p>
+    <w:p>
+      <w:r>
+        <w:rPr>
+          <w:b/>
+          <w:bCs/>
+        </w:rPr>
+        <w:t xml:space="preserve">Entidad: </w:t>
+      </w:r>
+      <w:r>
+        <w:t xml:space="preserve"> proveedor</w:t>
+      </w:r>
+    </w:p>
+    <w:p>
+      <w:pPr>
+        <w:rPr>
+          <w:b/>
+          <w:bCs/>
+        </w:rPr>
+      </w:pPr>
+      <w:r>
+        <w:rPr>
+          <w:b/>
+          <w:bCs/>
+        </w:rPr>
+        <w:t>Llave primaria (PK) CUIT</w:t>
+      </w:r>
+      <w:r>
+        <w:rPr>
+          <w:b/>
+          <w:bCs/>
+        </w:rPr>
+        <w:t xml:space="preserve"> </w:t>
+      </w:r>
+      <w:r>
+        <w:t>(</w:t>
+      </w:r>
+      <w:r>
+        <w:t xml:space="preserve">clave única de identificación </w:t>
+      </w:r>
+      <w:proofErr w:type="gramStart"/>
+      <w:r>
+        <w:t xml:space="preserve">tributaria </w:t>
+      </w:r>
+      <w:r>
+        <w:t>)</w:t>
+      </w:r>
+      <w:proofErr w:type="gramEnd"/>
+    </w:p>
+    <w:p>
+      <w:pPr>
+        <w:rPr>
+          <w:b/>
+          <w:bCs/>
+        </w:rPr>
+      </w:pPr>
+      <w:r>
+        <w:rPr>
+          <w:b/>
+          <w:bCs/>
+        </w:rPr>
+        <w:t xml:space="preserve">Atributo simple </w:t>
+      </w:r>
+      <w:proofErr w:type="spellStart"/>
+      <w:r>
+        <w:rPr>
+          <w:b/>
+          <w:bCs/>
+        </w:rPr>
+        <w:t>razonSocial</w:t>
+      </w:r>
+      <w:proofErr w:type="spellEnd"/>
+      <w:r>
+        <w:rPr>
+          <w:b/>
+          <w:bCs/>
+        </w:rPr>
+        <w:t xml:space="preserve"> </w:t>
+      </w:r>
+    </w:p>
+    <w:p>
+      <w:pPr>
+        <w:rPr>
+          <w:b/>
+          <w:bCs/>
+        </w:rPr>
+      </w:pPr>
+      <w:r>
+        <w:rPr>
+          <w:b/>
+          <w:bCs/>
+        </w:rPr>
+        <w:t xml:space="preserve">Atributo </w:t>
+      </w:r>
+      <w:proofErr w:type="spellStart"/>
+      <w:r>
+        <w:rPr>
+          <w:b/>
+          <w:bCs/>
+        </w:rPr>
+        <w:t>Multvaluado</w:t>
+      </w:r>
+      <w:proofErr w:type="spellEnd"/>
+      <w:r>
+        <w:rPr>
+          <w:b/>
+          <w:bCs/>
+        </w:rPr>
+        <w:t xml:space="preserve"> </w:t>
+      </w:r>
+      <w:proofErr w:type="spellStart"/>
+      <w:r>
+        <w:rPr>
+          <w:b/>
+          <w:bCs/>
+        </w:rPr>
+        <w:t>variosTelefonos</w:t>
+      </w:r>
+      <w:proofErr w:type="spellEnd"/>
+    </w:p>
+    <w:p>
+      <w:r>
+        <w:rPr>
+          <w:b/>
+          <w:bCs/>
+        </w:rPr>
+        <w:t>Entidad:</w:t>
+      </w:r>
+      <w:r>
+        <w:t xml:space="preserve"> cliente</w:t>
+      </w:r>
+    </w:p>
+    <w:p>
+      <w:r>
+        <w:rPr>
+          <w:b/>
+          <w:bCs/>
+        </w:rPr>
+        <w:t>Llave primaria (PK) DNI</w:t>
+      </w:r>
+      <w:r>
+        <w:t xml:space="preserve"> (Documento nacional de identidad </w:t>
+      </w:r>
+      <w:proofErr w:type="spellStart"/>
+      <w:r>
+        <w:t>unico</w:t>
+      </w:r>
+      <w:proofErr w:type="spellEnd"/>
+      <w:r>
+        <w:t>)</w:t>
+      </w:r>
+    </w:p>
+    <w:p>
+      <w:r>
+        <w:rPr>
+          <w:b/>
+          <w:bCs/>
+        </w:rPr>
+        <w:t xml:space="preserve">Atributo Simple </w:t>
+      </w:r>
+      <w:proofErr w:type="spellStart"/>
+      <w:r>
+        <w:rPr>
+          <w:b/>
+          <w:bCs/>
+        </w:rPr>
+        <w:t>nombreCompleto</w:t>
+      </w:r>
+      <w:proofErr w:type="spellEnd"/>
+      <w:r>
+        <w:t xml:space="preserve"> (nombre)</w:t>
+      </w:r>
+    </w:p>
+    <w:p>
+      <w:r>
+        <w:rPr>
+          <w:b/>
+          <w:bCs/>
+        </w:rPr>
+        <w:t>Atributo simple email</w:t>
+      </w:r>
+      <w:r>
+        <w:t xml:space="preserve"> (correo)</w:t>
+      </w:r>
+    </w:p>
+    <w:p>
+      <w:r>
+        <w:rPr>
+          <w:b/>
+          <w:bCs/>
+        </w:rPr>
+        <w:t xml:space="preserve">Atributo multivaluado y </w:t>
+      </w:r>
+      <w:proofErr w:type="gramStart"/>
+      <w:r>
+        <w:rPr>
+          <w:b/>
+          <w:bCs/>
+        </w:rPr>
+        <w:t>compuesto</w:t>
+      </w:r>
+      <w:r>
+        <w:t xml:space="preserve"> </w:t>
+      </w:r>
+      <w:r>
+        <w:t xml:space="preserve"> </w:t>
+      </w:r>
+      <w:proofErr w:type="spellStart"/>
+      <w:r>
+        <w:t>teléfonosContacto</w:t>
+      </w:r>
+      <w:proofErr w:type="spellEnd"/>
+      <w:proofErr w:type="gramEnd"/>
+      <w:r>
+        <w:t>(</w:t>
+      </w:r>
+      <w:r>
+        <w:t>el cliente tiene varios teléfonos y contiene número y código de área</w:t>
+      </w:r>
+      <w:r>
+        <w:t>)</w:t>
+      </w:r>
+    </w:p>
+    <w:p>
+      <w:r>
+        <w:rPr>
+          <w:b/>
+          <w:bCs/>
+        </w:rPr>
+        <w:t>Entidad:</w:t>
+      </w:r>
+      <w:r>
+        <w:t xml:space="preserve"> compra</w:t>
+      </w:r>
+    </w:p>
+    <w:p>
+      <w:pPr>
+        <w:rPr>
+          <w:b/>
+          <w:bCs/>
+        </w:rPr>
+      </w:pPr>
+      <w:r>
+        <w:rPr>
+          <w:b/>
+          <w:bCs/>
+        </w:rPr>
+        <w:lastRenderedPageBreak/>
+        <w:t xml:space="preserve">Llave primaria (PK) </w:t>
+      </w:r>
+      <w:proofErr w:type="spellStart"/>
+      <w:r>
+        <w:rPr>
+          <w:b/>
+          <w:bCs/>
+        </w:rPr>
+        <w:t>fechaHoraCompra</w:t>
+      </w:r>
+      <w:proofErr w:type="spellEnd"/>
+      <w:r>
+        <w:rPr>
+          <w:b/>
+          <w:bCs/>
+        </w:rPr>
+        <w:t xml:space="preserve"> </w:t>
+      </w:r>
+    </w:p>
+    <w:p>
+      <w:pPr>
+        <w:rPr>
+          <w:b/>
+          <w:bCs/>
+        </w:rPr>
+      </w:pPr>
+      <w:r>
+        <w:rPr>
+          <w:b/>
+          <w:bCs/>
+        </w:rPr>
+        <w:t xml:space="preserve">Atributo simple </w:t>
+      </w:r>
+      <w:proofErr w:type="spellStart"/>
+      <w:r>
+        <w:rPr>
+          <w:b/>
+          <w:bCs/>
+        </w:rPr>
+        <w:t>formaPago</w:t>
+      </w:r>
+      <w:proofErr w:type="spellEnd"/>
+    </w:p>
+    <w:p>
+      <w:r>
+        <w:rPr>
+          <w:b/>
+          <w:bCs/>
+        </w:rPr>
+        <w:t>Entidad:</w:t>
+      </w:r>
+      <w:r>
+        <w:t xml:space="preserve"> </w:t>
+      </w:r>
+      <w:proofErr w:type="spellStart"/>
+      <w:r>
+        <w:t>supercupon</w:t>
+      </w:r>
+      <w:proofErr w:type="spellEnd"/>
+    </w:p>
+    <w:p>
+      <w:r>
+        <w:rPr>
+          <w:b/>
+          <w:bCs/>
+        </w:rPr>
+        <w:t xml:space="preserve">Llave principal (PK) </w:t>
+      </w:r>
+      <w:proofErr w:type="spellStart"/>
+      <w:r>
+        <w:rPr>
+          <w:b/>
+          <w:bCs/>
+        </w:rPr>
+        <w:t>numeroCupon</w:t>
+      </w:r>
+      <w:proofErr w:type="spellEnd"/>
+      <w:r>
+        <w:t xml:space="preserve"> (</w:t>
+      </w:r>
+      <w:proofErr w:type="spellStart"/>
+      <w:r>
+        <w:t>numero</w:t>
+      </w:r>
+      <w:proofErr w:type="spellEnd"/>
+      <w:r>
+        <w:t xml:space="preserve"> único del </w:t>
+      </w:r>
+      <w:proofErr w:type="spellStart"/>
+      <w:r>
+        <w:t>cupon</w:t>
+      </w:r>
+      <w:proofErr w:type="spellEnd"/>
+      <w:r>
+        <w:t>)</w:t>
+      </w:r>
+    </w:p>
+    <w:p>
+      <w:r>
+        <w:rPr>
+          <w:b/>
+          <w:bCs/>
+        </w:rPr>
+        <w:t xml:space="preserve">Atributo Simple </w:t>
+      </w:r>
+      <w:proofErr w:type="spellStart"/>
+      <w:r>
+        <w:rPr>
+          <w:b/>
+          <w:bCs/>
+        </w:rPr>
+        <w:t>importeDescuento</w:t>
+      </w:r>
+      <w:proofErr w:type="spellEnd"/>
+      <w:r>
+        <w:t xml:space="preserve"> (valor del descuento)</w:t>
+      </w:r>
+    </w:p>
+    <w:p>
+      <w:r>
+        <w:rPr>
+          <w:b/>
+          <w:bCs/>
+        </w:rPr>
+        <w:t xml:space="preserve">Atributo Simple </w:t>
+      </w:r>
+      <w:proofErr w:type="spellStart"/>
+      <w:r>
+        <w:rPr>
+          <w:b/>
+          <w:bCs/>
+        </w:rPr>
+        <w:t>fechaHoraVencimiento</w:t>
+      </w:r>
+      <w:proofErr w:type="spellEnd"/>
+      <w:r>
+        <w:t xml:space="preserve"> (fecha y hora de vencimiento)</w:t>
+      </w:r>
+    </w:p>
+    <w:p>
+      <w:r>
+        <w:rPr>
+          <w:noProof/>
+        </w:rPr>
+        <w:drawing>
+          <wp:inline distT="0" distB="0" distL="0" distR="0" wp14:anchorId="7CE34256" wp14:editId="4723EDDC">
+            <wp:extent cx="5597525" cy="1960245"/>
+            <wp:effectExtent l="0" t="0" r="3175" b="1905"/>
+            <wp:docPr id="1882103764" name="Imagen 2"/>
+            <wp:cNvGraphicFramePr>
+              <a:graphicFrameLocks xmlns:a="http://schemas.openxmlformats.org/drawingml/2006/main" noChangeAspect="1"/>
+            </wp:cNvGraphicFramePr>
+            <a:graphic xmlns:a="http://schemas.openxmlformats.org/drawingml/2006/main">
+              <a:graphicData uri="http://schemas.openxmlformats.org/drawingml/2006/picture">
+                <pic:pic xmlns:pic="http://schemas.openxmlformats.org/drawingml/2006/picture">
+                  <pic:nvPicPr>
+                    <pic:cNvPr id="0" name="Picture 2"/>
+                    <pic:cNvPicPr>
+                      <a:picLocks noChangeAspect="1" noChangeArrowheads="1"/>
+                    </pic:cNvPicPr>
+                  </pic:nvPicPr>
+                  <pic:blipFill>
+                    <a:blip r:embed="rId15" cstate="print">
+                      <a:extLst>
+                        <a:ext uri="{28A0092B-C50C-407E-A947-70E740481C1C}">
+                          <a14:useLocalDpi xmlns:a14="http://schemas.microsoft.com/office/drawing/2010/main" val="0"/>
+                        </a:ext>
+                      </a:extLst>
+                    </a:blip>
+                    <a:srcRect/>
+                    <a:stretch>
+                      <a:fillRect/>
+                    </a:stretch>
+                  </pic:blipFill>
+                  <pic:spPr bwMode="auto">
+                    <a:xfrm>
+                      <a:off x="0" y="0"/>
+                      <a:ext cx="5597525" cy="1960245"/>
+                    </a:xfrm>
+                    <a:prstGeom prst="rect">
+                      <a:avLst/>
+                    </a:prstGeom>
+                    <a:noFill/>
+                    <a:ln>
+                      <a:noFill/>
+                    </a:ln>
+                  </pic:spPr>
+                </pic:pic>
+              </a:graphicData>
+            </a:graphic>
+          </wp:inline>
+        </w:drawing>
+      </w:r>
     </w:p>
     <w:p/>
     <w:p/>
@@ -4724,9 +5542,48 @@
     <w:p>
       <w:pPr>
         <w:rPr>
-          <w:rFonts w:ascii="Arial" w:hAnsi="Arial" w:cs="Arial"/>
-          <w:b/>
-          <w:bCs/>
+          <w:b/>
+          <w:bCs/>
+        </w:rPr>
+      </w:pPr>
+    </w:p>
+    <w:p/>
+    <w:p/>
+    <w:p/>
+    <w:p/>
+    <w:p/>
+    <w:p>
+      <w:pPr>
+        <w:rPr>
+          <w:b/>
+          <w:bCs/>
+        </w:rPr>
+      </w:pPr>
+    </w:p>
+    <w:p>
+      <w:pPr>
+        <w:rPr>
+          <w:b/>
+          <w:bCs/>
+        </w:rPr>
+      </w:pPr>
+    </w:p>
+    <w:p>
+      <w:pPr>
+        <w:rPr>
+          <w:b/>
+          <w:bCs/>
+        </w:rPr>
+      </w:pPr>
+    </w:p>
+    <w:p/>
+    <w:p/>
+    <w:p/>
+    <w:p/>
+    <w:p>
+      <w:pPr>
+        <w:rPr>
+          <w:rFonts w:ascii="Arial" w:hAnsi="Arial" w:cs="Arial"/>
           <w:sz w:val="28"/>
           <w:szCs w:val="28"/>
         </w:rPr>
@@ -4734,13 +5591,44 @@
       <w:r>
         <w:rPr>
           <w:rFonts w:ascii="Arial" w:hAnsi="Arial" w:cs="Arial"/>
-          <w:b/>
-          <w:bCs/>
           <w:sz w:val="28"/>
           <w:szCs w:val="28"/>
         </w:rPr>
         <w:t>Bibliografía</w:t>
       </w:r>
+    </w:p>
+    <w:p>
+      <w:pPr>
+        <w:pStyle w:val="Prrafodelista"/>
+        <w:numPr>
+          <w:ilvl w:val="0"/>
+          <w:numId w:val="13"/>
+        </w:numPr>
+        <w:rPr>
+          <w:rFonts w:ascii="Arial" w:hAnsi="Arial" w:cs="Arial"/>
+          <w:sz w:val="28"/>
+          <w:szCs w:val="28"/>
+        </w:rPr>
+      </w:pPr>
+      <w:r>
+        <w:rPr>
+          <w:rFonts w:ascii="Arial" w:hAnsi="Arial" w:cs="Arial"/>
+          <w:sz w:val="28"/>
+          <w:szCs w:val="28"/>
+        </w:rPr>
+        <w:t>Herramienta: Dia</w:t>
+      </w:r>
+    </w:p>
+    <w:p>
+      <w:pPr>
+        <w:rPr>
+          <w:rFonts w:ascii="Arial" w:hAnsi="Arial" w:cs="Arial"/>
+          <w:b/>
+          <w:bCs/>
+          <w:sz w:val="28"/>
+          <w:szCs w:val="28"/>
+        </w:rPr>
+      </w:pPr>
     </w:p>
     <w:p>
       <w:pPr>
@@ -4777,7 +5665,7 @@
       </w:pPr>
     </w:p>
     <w:sectPr>
-      <w:headerReference w:type="default" r:id="rId14"/>
+      <w:headerReference w:type="default" r:id="rId16"/>
       <w:pgSz w:w="12240" w:h="15840"/>
       <w:pgMar w:top="1417" w:right="1701" w:bottom="1417" w:left="1701" w:header="708" w:footer="708" w:gutter="0"/>
       <w:cols w:space="708"/>
@@ -6047,6 +6935,119 @@
       </w:pPr>
     </w:lvl>
   </w:abstractNum>
+  <w:abstractNum w:abstractNumId="12" w15:restartNumberingAfterBreak="0">
+    <w:nsid w:val="7FB1060A"/>
+    <w:multiLevelType w:val="hybridMultilevel"/>
+    <w:tmpl w:val="C96A8838"/>
+    <w:lvl w:ilvl="0" w:tplc="240A0001">
+      <w:start w:val="1"/>
+      <w:numFmt w:val="bullet"/>
+      <w:lvlText w:val=""/>
+      <w:lvlJc w:val="left"/>
+      <w:pPr>
+        <w:ind w:left="720" w:hanging="360"/>
+      </w:pPr>
+      <w:rPr>
+        <w:rFonts w:ascii="Symbol" w:hAnsi="Symbol" w:hint="default"/>
+      </w:rPr>
+    </w:lvl>
+    <w:lvl w:ilvl="1" w:tplc="240A0003" w:tentative="1">
+      <w:start w:val="1"/>
+      <w:numFmt w:val="bullet"/>
+      <w:lvlText w:val="o"/>
+      <w:lvlJc w:val="left"/>
+      <w:pPr>
+        <w:ind w:left="1440" w:hanging="360"/>
+      </w:pPr>
+      <w:rPr>
+        <w:rFonts w:ascii="Courier New" w:hAnsi="Courier New" w:cs="Courier New" w:hint="default"/>
+      </w:rPr>
+    </w:lvl>
+    <w:lvl w:ilvl="2" w:tplc="240A0005" w:tentative="1">
+      <w:start w:val="1"/>
+      <w:numFmt w:val="bullet"/>
+      <w:lvlText w:val=""/>
+      <w:lvlJc w:val="left"/>
+      <w:pPr>
+        <w:ind w:left="2160" w:hanging="360"/>
+      </w:pPr>
+      <w:rPr>
+        <w:rFonts w:ascii="Wingdings" w:hAnsi="Wingdings" w:hint="default"/>
+      </w:rPr>
+    </w:lvl>
+    <w:lvl w:ilvl="3" w:tplc="240A0001" w:tentative="1">
+      <w:start w:val="1"/>
+      <w:numFmt w:val="bullet"/>
+      <w:lvlText w:val=""/>
+      <w:lvlJc w:val="left"/>
+      <w:pPr>
+        <w:ind w:left="2880" w:hanging="360"/>
+      </w:pPr>
+      <w:rPr>
+        <w:rFonts w:ascii="Symbol" w:hAnsi="Symbol" w:hint="default"/>
+      </w:rPr>
+    </w:lvl>
+    <w:lvl w:ilvl="4" w:tplc="240A0003" w:tentative="1">
+      <w:start w:val="1"/>
+      <w:numFmt w:val="bullet"/>
+      <w:lvlText w:val="o"/>
+      <w:lvlJc w:val="left"/>
+      <w:pPr>
+        <w:ind w:left="3600" w:hanging="360"/>
+      </w:pPr>
+      <w:rPr>
+        <w:rFonts w:ascii="Courier New" w:hAnsi="Courier New" w:cs="Courier New" w:hint="default"/>
+      </w:rPr>
+    </w:lvl>
+    <w:lvl w:ilvl="5" w:tplc="240A0005" w:tentative="1">
+      <w:start w:val="1"/>
+      <w:numFmt w:val="bullet"/>
+      <w:lvlText w:val=""/>
+      <w:lvlJc w:val="left"/>
+      <w:pPr>
+        <w:ind w:left="4320" w:hanging="360"/>
+      </w:pPr>
+      <w:rPr>
+        <w:rFonts w:ascii="Wingdings" w:hAnsi="Wingdings" w:hint="default"/>
+      </w:rPr>
+    </w:lvl>
+    <w:lvl w:ilvl="6" w:tplc="240A0001" w:tentative="1">
+      <w:start w:val="1"/>
+      <w:numFmt w:val="bullet"/>
+      <w:lvlText w:val=""/>
+      <w:lvlJc w:val="left"/>
+      <w:pPr>
+        <w:ind w:left="5040" w:hanging="360"/>
+      </w:pPr>
+      <w:rPr>
+        <w:rFonts w:ascii="Symbol" w:hAnsi="Symbol" w:hint="default"/>
+      </w:rPr>
+    </w:lvl>
+    <w:lvl w:ilvl="7" w:tplc="240A0003" w:tentative="1">
+      <w:start w:val="1"/>
+      <w:numFmt w:val="bullet"/>
+      <w:lvlText w:val="o"/>
+      <w:lvlJc w:val="left"/>
+      <w:pPr>
+        <w:ind w:left="5760" w:hanging="360"/>
+      </w:pPr>
+      <w:rPr>
+        <w:rFonts w:ascii="Courier New" w:hAnsi="Courier New" w:cs="Courier New" w:hint="default"/>
+      </w:rPr>
+    </w:lvl>
+    <w:lvl w:ilvl="8" w:tplc="240A0005" w:tentative="1">
+      <w:start w:val="1"/>
+      <w:numFmt w:val="bullet"/>
+      <w:lvlText w:val=""/>
+      <w:lvlJc w:val="left"/>
+      <w:pPr>
+        <w:ind w:left="6480" w:hanging="360"/>
+      </w:pPr>
+      <w:rPr>
+        <w:rFonts w:ascii="Wingdings" w:hAnsi="Wingdings" w:hint="default"/>
+      </w:rPr>
+    </w:lvl>
+  </w:abstractNum>
   <w:num w:numId="1" w16cid:durableId="1377240028">
     <w:abstractNumId w:val="8"/>
   </w:num>
@@ -6082,6 +7083,9 @@
   </w:num>
   <w:num w:numId="12" w16cid:durableId="2017534424">
     <w:abstractNumId w:val="9"/>
+  </w:num>
+  <w:num w:numId="13" w16cid:durableId="1806435394">
+    <w:abstractNumId w:val="12"/>
   </w:num>
 </w:numbering>
 </file>
@@ -6550,10 +7554,31 @@
       <w:szCs w:val="24"/>
     </w:rPr>
   </w:style>
+  <w:style w:type="paragraph" w:styleId="Ttulo4">
+    <w:name w:val="heading 4"/>
+    <w:basedOn w:val="Normal"/>
+    <w:next w:val="Normal"/>
+    <w:link w:val="Ttulo4Car"/>
+    <w:uiPriority w:val="9"/>
+    <w:unhideWhenUsed/>
+    <w:qFormat/>
+    <w:rsid w:val="001F12FB"/>
+    <w:pPr>
+      <w:keepNext/>
+      <w:keepLines/>
+      <w:spacing w:before="40" w:after="0"/>
+      <w:outlineLvl w:val="3"/>
+    </w:pPr>
+    <w:rPr>
+      <w:rFonts w:asciiTheme="majorHAnsi" w:eastAsiaTheme="majorEastAsia" w:hAnsiTheme="majorHAnsi" w:cstheme="majorBidi"/>
+      <w:i/>
+      <w:iCs/>
+      <w:color w:val="2F5496" w:themeColor="accent1" w:themeShade="BF"/>
+    </w:rPr>
+  </w:style>
   <w:style w:type="character" w:default="1" w:styleId="Fuentedeprrafopredeter">
     <w:name w:val="Default Paragraph Font"/>
     <w:uiPriority w:val="1"/>
-    <w:semiHidden/>
     <w:unhideWhenUsed/>
   </w:style>
   <w:style w:type="table" w:default="1" w:styleId="Tablanormal">
@@ -6806,6 +7831,19 @@
       <w:rFonts w:eastAsiaTheme="minorEastAsia"/>
       <w:color w:val="5A5A5A" w:themeColor="text1" w:themeTint="A5"/>
       <w:spacing w:val="15"/>
+    </w:rPr>
+  </w:style>
+  <w:style w:type="character" w:customStyle="1" w:styleId="Ttulo4Car">
+    <w:name w:val="Título 4 Car"/>
+    <w:basedOn w:val="Fuentedeprrafopredeter"/>
+    <w:link w:val="Ttulo4"/>
+    <w:uiPriority w:val="9"/>
+    <w:rsid w:val="001F12FB"/>
+    <w:rPr>
+      <w:rFonts w:asciiTheme="majorHAnsi" w:eastAsiaTheme="majorEastAsia" w:hAnsiTheme="majorHAnsi" w:cstheme="majorBidi"/>
+      <w:i/>
+      <w:iCs/>
+      <w:color w:val="2F5496" w:themeColor="accent1" w:themeShade="BF"/>
     </w:rPr>
   </w:style>
 </w:styles>

</xml_diff>